<commit_message>
3.	Arquitectura Distribuida o en la Nube
</commit_message>
<xml_diff>
--- a/Sistema basado en un agente inteligente para la consulta de archivos locales mediante lenguaje natural.docx
+++ b/Sistema basado en un agente inteligente para la consulta de archivos locales mediante lenguaje natural.docx
@@ -219,6 +219,166 @@
         </w:rPr>
         <w:t>, se contempla un módulo de interfaz de usuario para capturar la consulta, un módulo de procesamiento de lenguaje natural para interpretar la pregunta, un módulo de exploración y lectura de archivos para acceder a los documentos locales, un módulo de análisis de contenido para localizar la información solicitada y un módulo de respuesta para presentar los resultados al usuario.</w:t>
       </w:r>
+    </w:p>
+    <w:p>
+      <w:pPr>
+        <w:pStyle w:val="Prrafodelista"/>
+        <w:numPr>
+          <w:ilvl w:val="0"/>
+          <w:numId w:val="1"/>
+        </w:numPr>
+        <w:jc w:val="both"/>
+        <w:rPr>
+          <w:rFonts w:ascii="Times New Roman" w:hAnsi="Times New Roman" w:cs="Times New Roman"/>
+          <w:b/>
+          <w:bCs/>
+        </w:rPr>
+      </w:pPr>
+      <w:r>
+        <w:rPr>
+          <w:rFonts w:ascii="Times New Roman" w:hAnsi="Times New Roman" w:cs="Times New Roman"/>
+          <w:b/>
+          <w:bCs/>
+        </w:rPr>
+        <w:t>Arquitectura Distribuida o en la Nube</w:t>
+      </w:r>
+    </w:p>
+    <w:p>
+      <w:pPr>
+        <w:jc w:val="both"/>
+        <w:rPr>
+          <w:rFonts w:ascii="Times New Roman" w:hAnsi="Times New Roman" w:cs="Times New Roman"/>
+        </w:rPr>
+      </w:pPr>
+      <w:r>
+        <w:rPr>
+          <w:rFonts w:ascii="Times New Roman" w:hAnsi="Times New Roman" w:cs="Times New Roman"/>
+        </w:rPr>
+        <w:t xml:space="preserve">El sistema propuesto utilizará una arquitectura de tipo </w:t>
+      </w:r>
+      <w:r>
+        <w:rPr>
+          <w:rFonts w:ascii="Times New Roman" w:hAnsi="Times New Roman" w:cs="Times New Roman"/>
+          <w:b/>
+          <w:bCs/>
+        </w:rPr>
+        <w:t>cliente-servidor local</w:t>
+      </w:r>
+      <w:r>
+        <w:rPr>
+          <w:rFonts w:ascii="Times New Roman" w:hAnsi="Times New Roman" w:cs="Times New Roman"/>
+        </w:rPr>
+        <w:t>, debido a que se trata de una aplicación de escritorio orientada a consultar archivos almacenados en la computadora del usuario. En este modelo, la interfaz de escritorio funcionará como el cliente, mientras que los módulos internos del sistema actuarán como servicios encargados de procesar las consultas, analizar los archivos y generar las respuestas.</w:t>
+      </w:r>
+    </w:p>
+    <w:p>
+      <w:pPr>
+        <w:jc w:val="both"/>
+        <w:rPr>
+          <w:rFonts w:ascii="Times New Roman" w:hAnsi="Times New Roman" w:cs="Times New Roman"/>
+        </w:rPr>
+      </w:pPr>
+      <w:r>
+        <w:rPr>
+          <w:rFonts w:ascii="Times New Roman" w:hAnsi="Times New Roman" w:cs="Times New Roman"/>
+        </w:rPr>
+        <w:lastRenderedPageBreak/>
+        <w:t>A diferencia de una plataforma completamente en la nube, este sistema trabajará principalmente de forma local, ya que los documentos consultados se encuentran almacenados en el equipo del usuario. Esto permite mantener mayor control sobre la información y reducir la dependencia de una conexión constante a internet. Sin embargo, de manera opcional, el sistema podría integrar servicios en la nube para mejorar el procesamiento del lenguaje natural o permitir futuras funciones de respaldo y sincronización de archivos.</w:t>
+      </w:r>
+    </w:p>
+    <w:p>
+      <w:pPr>
+        <w:jc w:val="both"/>
+        <w:rPr>
+          <w:rFonts w:ascii="Times New Roman" w:hAnsi="Times New Roman" w:cs="Times New Roman"/>
+        </w:rPr>
+      </w:pPr>
+      <w:r>
+        <w:rPr>
+          <w:rFonts w:ascii="Times New Roman" w:hAnsi="Times New Roman" w:cs="Times New Roman"/>
+        </w:rPr>
+        <w:t>La arquitectura interna estará compuesta por varios módulos principales. El usuario realizará una consulta mediante la interfaz gráfica del sistema. Posteriormente, la consulta será enviada al módulo de procesamiento de lenguaje natural, el cual interpretará la intención de la pregunta. Después, el módulo de exploración de archivos buscará dentro de las carpetas seleccionadas y enviará el contenido relevante al módulo de análisis. Finalmente, el sistema generará una respuesta clara para el usuario con base en la información encontrada.</w:t>
+      </w:r>
+    </w:p>
+    <w:p>
+      <w:pPr>
+        <w:jc w:val="both"/>
+        <w:rPr>
+          <w:rFonts w:ascii="Times New Roman" w:hAnsi="Times New Roman" w:cs="Times New Roman"/>
+        </w:rPr>
+      </w:pPr>
+      <w:r>
+        <w:rPr>
+          <w:rFonts w:ascii="Times New Roman" w:hAnsi="Times New Roman" w:cs="Times New Roman"/>
+        </w:rPr>
+        <w:t>En cuanto al almacenamiento, el sistema no requiere necesariamente una base de datos compleja, ya que su función principal es leer archivos locales. No obstante, puede utilizar una base de datos ligera, como SQLite, para guardar configuraciones, historial de consultas, rutas de carpetas analizadas y metadatos de los documentos. Esto permitiría mejorar la velocidad de búsqueda y evitar analizar los mismos archivos repetidamente.</w:t>
+      </w:r>
+    </w:p>
+    <w:p>
+      <w:pPr>
+        <w:jc w:val="both"/>
+        <w:rPr>
+          <w:rFonts w:ascii="Times New Roman" w:hAnsi="Times New Roman" w:cs="Times New Roman"/>
+        </w:rPr>
+      </w:pPr>
+      <w:r>
+        <w:rPr>
+          <w:rFonts w:ascii="Times New Roman" w:hAnsi="Times New Roman" w:cs="Times New Roman"/>
+        </w:rPr>
+        <w:t>El flujo de información del sistema puede representarse de la siguiente manera:</w:t>
+      </w:r>
+    </w:p>
+    <w:p>
+      <w:pPr>
+        <w:jc w:val="both"/>
+        <w:rPr>
+          <w:rFonts w:ascii="Times New Roman" w:hAnsi="Times New Roman" w:cs="Times New Roman"/>
+        </w:rPr>
+      </w:pPr>
+      <w:r>
+        <w:rPr>
+          <w:rFonts w:ascii="Times New Roman" w:hAnsi="Times New Roman" w:cs="Times New Roman"/>
+          <w:b/>
+          <w:bCs/>
+        </w:rPr>
+        <w:t>Usuario → Interfaz de escritorio → Procesamiento de lenguaje natural → Exploración de archivos locales → Análisis de contenido → Generación de respuesta → Usuario</w:t>
+      </w:r>
+    </w:p>
+    <w:p>
+      <w:pPr>
+        <w:jc w:val="both"/>
+        <w:rPr>
+          <w:rFonts w:ascii="Times New Roman" w:hAnsi="Times New Roman" w:cs="Times New Roman"/>
+        </w:rPr>
+      </w:pPr>
+      <w:r>
+        <w:rPr>
+          <w:rFonts w:ascii="Times New Roman" w:hAnsi="Times New Roman" w:cs="Times New Roman"/>
+        </w:rPr>
+        <w:t xml:space="preserve">Esta arquitectura permite que el sistema sea modular, escalable y fácil de mantener. Además, facilita que en el futuro se puedan agregar nuevas funciones, como conexión con servicios en la nube, sincronización entre dispositivos o integración con </w:t>
+      </w:r>
+      <w:proofErr w:type="spellStart"/>
+      <w:r>
+        <w:rPr>
+          <w:rFonts w:ascii="Times New Roman" w:hAnsi="Times New Roman" w:cs="Times New Roman"/>
+        </w:rPr>
+        <w:t>APIs</w:t>
+      </w:r>
+      <w:proofErr w:type="spellEnd"/>
+      <w:r>
+        <w:rPr>
+          <w:rFonts w:ascii="Times New Roman" w:hAnsi="Times New Roman" w:cs="Times New Roman"/>
+        </w:rPr>
+        <w:t xml:space="preserve"> externas para mejorar la precisión de las respuestas.</w:t>
+      </w:r>
+    </w:p>
+    <w:p>
+      <w:pPr>
+        <w:jc w:val="both"/>
+        <w:rPr>
+          <w:rFonts w:ascii="Times New Roman" w:hAnsi="Times New Roman" w:cs="Times New Roman"/>
+        </w:rPr>
+      </w:pPr>
     </w:p>
     <w:p>
       <w:pPr>
@@ -251,7 +411,7 @@
   <w:abstractNum w:abstractNumId="0" w15:restartNumberingAfterBreak="0">
     <w:nsid w:val="0C901F4F"/>
     <w:multiLevelType w:val="hybridMultilevel"/>
-    <w:tmpl w:val="60B20130"/>
+    <w:tmpl w:val="953EF1EE"/>
     <w:lvl w:ilvl="0" w:tplc="080A000F">
       <w:start w:val="1"/>
       <w:numFmt w:val="decimal"/>

</xml_diff>